<commit_message>
fix: homework display in topic view and lesson details with fallback
</commit_message>
<xml_diff>
--- a/agents/teaching/context/materials/dz_liza_morozova_drobi_osnovnye_ponyatiya.docx
+++ b/agents/teaching/context/materials/dz_liza_morozova_drobi_osnovnye_ponyatiya.docx
@@ -43,7 +43,22 @@
         <w:t xml:space="preserve">Дата:</w:t>
       </w:r>
       <w:r>
-        <w:t xml:space="preserve"> 2026-03-22</w:t>
+        <w:t xml:space="preserve"> 2026-03-24</w:t>
+      </w:r>
+    </w:p>
+    <w:p>
+      <w:pPr>
+        <w:spacing w:after="120"/>
+      </w:pPr>
+      <w:r>
+        <w:rPr>
+          <w:b/>
+          <w:bCs/>
+        </w:rPr>
+        <w:t xml:space="preserve">Тема:</w:t>
+      </w:r>
+      <w:r>
+        <w:t xml:space="preserve"> Дроби: основные понятия (числитель и знаменатель)</w:t>
       </w:r>
     </w:p>
     <w:p>
@@ -70,20 +85,87 @@
         <w:pStyle w:val="Heading2"/>
       </w:pPr>
       <w:r>
-        <w:t xml:space="preserve">Задание 1</w:t>
-      </w:r>
-    </w:p>
-    <w:p>
-      <w:pPr>
-        <w:spacing w:after="120"/>
-      </w:pPr>
-    </w:p>
-    <w:p>
-      <w:pPr>
-        <w:spacing w:after="120"/>
-      </w:pPr>
-      <w:r>
-        <w:t xml:space="preserve">Запиши дробь, у которой числитель равен 3, а знаменатель равен 8. Нарисуй круг и закрась соответствующую часть.</w:t>
+        <w:t xml:space="preserve">Задание 1. Назови числитель и знаменатель</w:t>
+      </w:r>
+    </w:p>
+    <w:p>
+      <w:pPr>
+        <w:spacing w:after="120"/>
+      </w:pPr>
+    </w:p>
+    <w:p>
+      <w:pPr>
+        <w:spacing w:after="120"/>
+      </w:pPr>
+      <w:r>
+        <w:t xml:space="preserve">Для каждой дроби запиши, чему равен числитель и чему равен знаменатель:</w:t>
+      </w:r>
+    </w:p>
+    <w:p>
+      <w:pPr>
+        <w:spacing w:after="120"/>
+      </w:pPr>
+    </w:p>
+    <w:p>
+      <w:pPr>
+        <w:spacing w:after="120"/>
+      </w:pPr>
+      <w:r>
+        <w:t xml:space="preserve">a) 3/7</w:t>
+      </w:r>
+    </w:p>
+    <w:p>
+      <w:pPr>
+        <w:spacing w:after="120"/>
+      </w:pPr>
+      <w:r>
+        <w:t xml:space="preserve">b) 1/4</w:t>
+      </w:r>
+    </w:p>
+    <w:p>
+      <w:pPr>
+        <w:spacing w:after="120"/>
+      </w:pPr>
+      <w:r>
+        <w:t xml:space="preserve">c) 5/8</w:t>
+      </w:r>
+    </w:p>
+    <w:p>
+      <w:pPr>
+        <w:spacing w:after="120"/>
+      </w:pPr>
+      <w:r>
+        <w:t xml:space="preserve">d) 2/3</w:t>
+      </w:r>
+    </w:p>
+    <w:p>
+      <w:pPr>
+        <w:spacing w:after="120"/>
+      </w:pPr>
+      <w:r>
+        <w:t xml:space="preserve">e) 9/10</w:t>
+      </w:r>
+    </w:p>
+    <w:p>
+      <w:pPr>
+        <w:spacing w:after="120"/>
+      </w:pPr>
+      <w:r>
+        <w:t xml:space="preserve">f) 4/5</w:t>
+      </w:r>
+    </w:p>
+    <w:p>
+      <w:pPr>
+        <w:spacing w:after="120"/>
+      </w:pPr>
+    </w:p>
+    <w:p>
+      <w:pPr>
+        <w:spacing w:after="200" w:before="200"/>
+        <w:jc w:val="center"/>
+      </w:pPr>
+      <w:r>
+        <w:t xml:space="preserve">──────────────────────────────────────────────────</w:t>
       </w:r>
     </w:p>
     <w:p>
@@ -96,57 +178,71 @@
         <w:pStyle w:val="Heading2"/>
       </w:pPr>
       <w:r>
-        <w:t xml:space="preserve">Задание 2</w:t>
-      </w:r>
-    </w:p>
-    <w:p>
-      <w:pPr>
-        <w:spacing w:after="120"/>
-      </w:pPr>
-    </w:p>
-    <w:p>
-      <w:pPr>
-        <w:spacing w:after="120"/>
-      </w:pPr>
-      <w:r>
-        <w:t xml:space="preserve">Назови числитель и знаменатель каждой дроби:</w:t>
-      </w:r>
-    </w:p>
-    <w:p>
-      <w:pPr>
-        <w:spacing w:after="120"/>
-      </w:pPr>
-    </w:p>
-    <w:p>
-      <w:pPr>
-        <w:spacing w:after="120"/>
-      </w:pPr>
-      <w:r>
-        <w:t xml:space="preserve">a) 5/12</w:t>
-      </w:r>
-    </w:p>
-    <w:p>
-      <w:pPr>
-        <w:spacing w:after="120"/>
-      </w:pPr>
-      <w:r>
-        <w:t xml:space="preserve">b) 1/4</w:t>
-      </w:r>
-    </w:p>
-    <w:p>
-      <w:pPr>
-        <w:spacing w:after="120"/>
-      </w:pPr>
-      <w:r>
-        <w:t xml:space="preserve">c) 7/10</w:t>
-      </w:r>
-    </w:p>
-    <w:p>
-      <w:pPr>
-        <w:spacing w:after="120"/>
-      </w:pPr>
-      <w:r>
-        <w:t xml:space="preserve">d) 11/25</w:t>
+        <w:t xml:space="preserve">Задание 2. Запиши дробь по описанию</w:t>
+      </w:r>
+    </w:p>
+    <w:p>
+      <w:pPr>
+        <w:spacing w:after="120"/>
+      </w:pPr>
+    </w:p>
+    <w:p>
+      <w:pPr>
+        <w:spacing w:after="120"/>
+      </w:pPr>
+      <w:r>
+        <w:t xml:space="preserve">Запиши в виде дроби:</w:t>
+      </w:r>
+    </w:p>
+    <w:p>
+      <w:pPr>
+        <w:spacing w:after="120"/>
+      </w:pPr>
+    </w:p>
+    <w:p>
+      <w:pPr>
+        <w:spacing w:after="120"/>
+      </w:pPr>
+      <w:r>
+        <w:t xml:space="preserve">a) Числитель равен 2, знаменатель равен 9</w:t>
+      </w:r>
+    </w:p>
+    <w:p>
+      <w:pPr>
+        <w:spacing w:after="120"/>
+      </w:pPr>
+      <w:r>
+        <w:t xml:space="preserve">b) Числитель равен 7, знаменатель равен 12</w:t>
+      </w:r>
+    </w:p>
+    <w:p>
+      <w:pPr>
+        <w:spacing w:after="120"/>
+      </w:pPr>
+      <w:r>
+        <w:t xml:space="preserve">c) Три восьмых</w:t>
+      </w:r>
+    </w:p>
+    <w:p>
+      <w:pPr>
+        <w:spacing w:after="120"/>
+      </w:pPr>
+      <w:r>
+        <w:t xml:space="preserve">d) Одна шестая</w:t>
+      </w:r>
+    </w:p>
+    <w:p>
+      <w:pPr>
+        <w:spacing w:after="120"/>
+      </w:pPr>
+    </w:p>
+    <w:p>
+      <w:pPr>
+        <w:spacing w:after="200" w:before="200"/>
+        <w:jc w:val="center"/>
+      </w:pPr>
+      <w:r>
+        <w:t xml:space="preserve">──────────────────────────────────────────────────</w:t>
       </w:r>
     </w:p>
     <w:p>
@@ -159,49 +255,86 @@
         <w:pStyle w:val="Heading2"/>
       </w:pPr>
       <w:r>
-        <w:t xml:space="preserve">Задание 3</w:t>
-      </w:r>
-    </w:p>
-    <w:p>
-      <w:pPr>
-        <w:spacing w:after="120"/>
-      </w:pPr>
-    </w:p>
-    <w:p>
-      <w:pPr>
-        <w:spacing w:after="120"/>
-      </w:pPr>
-      <w:r>
-        <w:t xml:space="preserve">Прочитай описание и запиши дробь:</w:t>
-      </w:r>
-    </w:p>
-    <w:p>
-      <w:pPr>
-        <w:spacing w:after="120"/>
-      </w:pPr>
-    </w:p>
-    <w:p>
-      <w:pPr>
-        <w:spacing w:after="120"/>
-      </w:pPr>
-      <w:r>
-        <w:t xml:space="preserve">a) Пирог разрезали на 6 равных частей и съели 2 части. Какая дробь показывает съеденную часть?</w:t>
-      </w:r>
-    </w:p>
-    <w:p>
-      <w:pPr>
-        <w:spacing w:after="120"/>
-      </w:pPr>
-      <w:r>
-        <w:t xml:space="preserve">b) В классе 30 учеников, из них 7 получили пятёрки. Какая дробь показывает долю отличников?</w:t>
-      </w:r>
-    </w:p>
-    <w:p>
-      <w:pPr>
-        <w:spacing w:after="120"/>
-      </w:pPr>
-      <w:r>
-        <w:t xml:space="preserve">c) Из 16 конфет в коробке Маша съела 5. Какая дробь показывает, сколько конфет осталось?</w:t>
+        <w:t xml:space="preserve">Задание 3. Доли целого</w:t>
+      </w:r>
+    </w:p>
+    <w:p>
+      <w:pPr>
+        <w:spacing w:after="120"/>
+      </w:pPr>
+    </w:p>
+    <w:p>
+      <w:pPr>
+        <w:spacing w:after="120"/>
+      </w:pPr>
+      <w:r>
+        <w:t xml:space="preserve">Реши задачи:</w:t>
+      </w:r>
+    </w:p>
+    <w:p>
+      <w:pPr>
+        <w:spacing w:after="120"/>
+      </w:pPr>
+    </w:p>
+    <w:p>
+      <w:pPr>
+        <w:spacing w:after="120"/>
+      </w:pPr>
+      <w:r>
+        <w:t xml:space="preserve">a) Пирог разрезали на 8 равных кусков. Лиза съела 3 куска. Какую дробь пирога она съела?</w:t>
+      </w:r>
+    </w:p>
+    <w:p>
+      <w:pPr>
+        <w:spacing w:after="120"/>
+      </w:pPr>
+    </w:p>
+    <w:p>
+      <w:pPr>
+        <w:spacing w:after="120"/>
+      </w:pPr>
+      <w:r>
+        <w:t xml:space="preserve">b) В коробке 6 конфет. Мама взяла 1 конфету. Какая доля конфет осталась в коробке?</w:t>
+      </w:r>
+    </w:p>
+    <w:p>
+      <w:pPr>
+        <w:spacing w:after="120"/>
+      </w:pPr>
+    </w:p>
+    <w:p>
+      <w:pPr>
+        <w:spacing w:after="120"/>
+      </w:pPr>
+      <w:r>
+        <w:t xml:space="preserve">c) Шоколадку разделили на 5 равных частей и раздали троим друзьям по одной части. Какую дробь шоколадки раздали? Какая дробь осталась?</w:t>
+      </w:r>
+    </w:p>
+    <w:p>
+      <w:pPr>
+        <w:spacing w:after="120"/>
+      </w:pPr>
+    </w:p>
+    <w:p>
+      <w:pPr>
+        <w:spacing w:after="120"/>
+      </w:pPr>
+      <w:r>
+        <w:t xml:space="preserve">d) В классе 10 учеников. 4 из них получили пятёрки. Какая доля класса получила пятёрки?</w:t>
+      </w:r>
+    </w:p>
+    <w:p>
+      <w:pPr>
+        <w:spacing w:after="120"/>
+      </w:pPr>
+    </w:p>
+    <w:p>
+      <w:pPr>
+        <w:spacing w:after="200" w:before="200"/>
+        <w:jc w:val="center"/>
+      </w:pPr>
+      <w:r>
+        <w:t xml:space="preserve">──────────────────────────────────────────────────</w:t>
       </w:r>
     </w:p>
     <w:p>
@@ -214,57 +347,90 @@
         <w:pStyle w:val="Heading2"/>
       </w:pPr>
       <w:r>
-        <w:t xml:space="preserve">Задание 4</w:t>
-      </w:r>
-    </w:p>
-    <w:p>
-      <w:pPr>
-        <w:spacing w:after="120"/>
-      </w:pPr>
-    </w:p>
-    <w:p>
-      <w:pPr>
-        <w:spacing w:after="120"/>
-      </w:pPr>
-      <w:r>
-        <w:t xml:space="preserve">Верно или неверно? Если неверно — исправь:</w:t>
-      </w:r>
-    </w:p>
-    <w:p>
-      <w:pPr>
-        <w:spacing w:after="120"/>
-      </w:pPr>
-    </w:p>
-    <w:p>
-      <w:pPr>
-        <w:spacing w:after="120"/>
-      </w:pPr>
-      <w:r>
-        <w:t xml:space="preserve">a) В дроби 3/7 числитель равен 7, а знаменатель равен 3.</w:t>
-      </w:r>
-    </w:p>
-    <w:p>
-      <w:pPr>
-        <w:spacing w:after="120"/>
-      </w:pPr>
-      <w:r>
-        <w:t xml:space="preserve">b) Знаменатель показывает, на сколько равных частей разделили целое.</w:t>
-      </w:r>
-    </w:p>
-    <w:p>
-      <w:pPr>
-        <w:spacing w:after="120"/>
-      </w:pPr>
-      <w:r>
-        <w:t xml:space="preserve">c) В дроби 9/2 числитель больше знаменателя — значит, это неправильная дробь.</w:t>
-      </w:r>
-    </w:p>
-    <w:p>
-      <w:pPr>
-        <w:spacing w:after="120"/>
-      </w:pPr>
-      <w:r>
-        <w:t xml:space="preserve">d) Числитель дроби 1/100 равен 100.</w:t>
+        <w:t xml:space="preserve">Задание 4. Нарисуй и закрась</w:t>
+      </w:r>
+    </w:p>
+    <w:p>
+      <w:pPr>
+        <w:spacing w:after="120"/>
+      </w:pPr>
+    </w:p>
+    <w:p>
+      <w:pPr>
+        <w:spacing w:after="120"/>
+      </w:pPr>
+      <w:r>
+        <w:t xml:space="preserve">Нарисуй фигуру и закрась нужную долю:</w:t>
+      </w:r>
+    </w:p>
+    <w:p>
+      <w:pPr>
+        <w:spacing w:after="120"/>
+      </w:pPr>
+    </w:p>
+    <w:p>
+      <w:pPr>
+        <w:spacing w:after="120"/>
+      </w:pPr>
+      <w:r>
+        <w:t xml:space="preserve">a) Нарисуй круг, раздели на 4 равные части. Закрась 3/4.</w:t>
+      </w:r>
+    </w:p>
+    <w:p>
+      <w:pPr>
+        <w:spacing w:after="120"/>
+      </w:pPr>
+    </w:p>
+    <w:p>
+      <w:pPr>
+        <w:spacing w:after="120"/>
+      </w:pPr>
+      <w:r>
+        <w:t xml:space="preserve">b) Нарисуй прямоугольник, раздели на 6 равных частей. Закрась 2/6.</w:t>
+      </w:r>
+    </w:p>
+    <w:p>
+      <w:pPr>
+        <w:spacing w:after="120"/>
+      </w:pPr>
+    </w:p>
+    <w:p>
+      <w:pPr>
+        <w:spacing w:after="120"/>
+      </w:pPr>
+      <w:r>
+        <w:t xml:space="preserve">c) Нарисуй квадрат, раздели на 9 равных частей. Закрась 5/9.</w:t>
+      </w:r>
+    </w:p>
+    <w:p>
+      <w:pPr>
+        <w:spacing w:after="120"/>
+      </w:pPr>
+    </w:p>
+    <w:p>
+      <w:pPr>
+        <w:spacing w:after="200" w:before="200"/>
+        <w:jc w:val="center"/>
+      </w:pPr>
+      <w:r>
+        <w:t xml:space="preserve">──────────────────────────────────────────────────</w:t>
+      </w:r>
+    </w:p>
+    <w:p>
+      <w:pPr>
+        <w:spacing w:after="120"/>
+      </w:pPr>
+    </w:p>
+    <w:p>
+      <w:pPr>
+        <w:spacing w:after="120"/>
+      </w:pPr>
+      <w:r>
+        <w:rPr>
+          <w:i/>
+          <w:iCs/>
+        </w:rPr>
+        <w:t xml:space="preserve">Удачи! 🍀</w:t>
       </w:r>
     </w:p>
     <w:sectPr>

</xml_diff>